<commit_message>
Updated worksheet and key
</commit_message>
<xml_diff>
--- a/emiliaagostinelli/boxplot_module/Worksheet.docx
+++ b/emiliaagostinelli/boxplot_module/Worksheet.docx
@@ -153,16 +153,26 @@
         <w:rPr>
           <w:rFonts w:ascii="Calibri" w:hAnsi="Calibri" w:cs="Calibri"/>
         </w:rPr>
-        <w:t xml:space="preserve">We are interested in exploring the relationship between first run order and final standings. Based on the description above, sketch out what you would hypothesize the boxplots for </w:t>
-      </w:r>
-      <w:proofErr w:type="gramStart"/>
-      <w:r>
-        <w:rPr>
-          <w:rFonts w:ascii="Calibri" w:hAnsi="Calibri" w:cs="Calibri"/>
-        </w:rPr>
-        <w:t>final results</w:t>
-      </w:r>
-      <w:proofErr w:type="gramEnd"/>
+        <w:t xml:space="preserve">We are interested in exploring the relationship between first run order and final </w:t>
+      </w:r>
+      <w:r>
+        <w:rPr>
+          <w:rFonts w:ascii="Calibri" w:hAnsi="Calibri" w:cs="Calibri"/>
+        </w:rPr>
+        <w:t>rank</w:t>
+      </w:r>
+      <w:r>
+        <w:rPr>
+          <w:rFonts w:ascii="Calibri" w:hAnsi="Calibri" w:cs="Calibri"/>
+        </w:rPr>
+        <w:t>. Based on the description above, sketch out what you would hypothesize the boxplots for final r</w:t>
+      </w:r>
+      <w:r>
+        <w:rPr>
+          <w:rFonts w:ascii="Calibri" w:hAnsi="Calibri" w:cs="Calibri"/>
+        </w:rPr>
+        <w:t>ank</w:t>
+      </w:r>
       <w:r>
         <w:rPr>
           <w:rFonts w:ascii="Calibri" w:hAnsi="Calibri" w:cs="Calibri"/>
@@ -300,18 +310,33 @@
           <w:ilvl w:val="0"/>
           <w:numId w:val="1"/>
         </w:numPr>
-      </w:pPr>
-      <w:r>
+        <w:rPr>
+          <w:rFonts w:ascii="Calibri" w:hAnsi="Calibri" w:cs="Calibri"/>
+        </w:rPr>
+      </w:pPr>
+      <w:r>
+        <w:rPr>
+          <w:rFonts w:ascii="Calibri" w:hAnsi="Calibri" w:cs="Calibri"/>
+        </w:rPr>
         <w:lastRenderedPageBreak/>
         <w:t xml:space="preserve">We can run an ANOVA model and use Tukey’s HSD to determine which groups are </w:t>
       </w:r>
       <w:r>
+        <w:rPr>
+          <w:rFonts w:ascii="Calibri" w:hAnsi="Calibri" w:cs="Calibri"/>
+        </w:rPr>
         <w:t>significantly</w:t>
       </w:r>
       <w:r>
+        <w:rPr>
+          <w:rFonts w:ascii="Calibri" w:hAnsi="Calibri" w:cs="Calibri"/>
+        </w:rPr>
         <w:t xml:space="preserve"> different. </w:t>
       </w:r>
       <w:r>
+        <w:rPr>
+          <w:rFonts w:ascii="Calibri" w:hAnsi="Calibri" w:cs="Calibri"/>
+        </w:rPr>
         <w:t>Does this match with your findings in the question above?</w:t>
       </w:r>
     </w:p>

</xml_diff>

<commit_message>
Making adjustments to boxplot worksheet, key, and module description.
</commit_message>
<xml_diff>
--- a/emiliaagostinelli/boxplot_module/Worksheet.docx
+++ b/emiliaagostinelli/boxplot_module/Worksheet.docx
@@ -126,7 +126,41 @@
           <w:sz w:val="24"/>
           <w:szCs w:val="24"/>
         </w:rPr>
-        <w:t xml:space="preserve"> In this worksheet, you will be tasked with understanding your data, finding summary statistics, performing a t-test, constructing a confidence interval, and interpreting your findings in the context of this setting.</w:t>
+        <w:t xml:space="preserve"> In this worksheet, you will be tasked with </w:t>
+      </w:r>
+      <w:r>
+        <w:rPr>
+          <w:rFonts w:ascii="Calibri" w:hAnsi="Calibri" w:cs="Calibri"/>
+          <w:sz w:val="24"/>
+          <w:szCs w:val="24"/>
+        </w:rPr>
+        <w:t xml:space="preserve">manipulating your data </w:t>
+      </w:r>
+      <w:r>
+        <w:rPr>
+          <w:rFonts w:ascii="Calibri" w:hAnsi="Calibri" w:cs="Calibri"/>
+          <w:sz w:val="24"/>
+          <w:szCs w:val="24"/>
+        </w:rPr>
+        <w:t xml:space="preserve">to answer our </w:t>
+      </w:r>
+      <w:proofErr w:type="gramStart"/>
+      <w:r>
+        <w:rPr>
+          <w:rFonts w:ascii="Calibri" w:hAnsi="Calibri" w:cs="Calibri"/>
+          <w:sz w:val="24"/>
+          <w:szCs w:val="24"/>
+        </w:rPr>
+        <w:t>question</w:t>
+      </w:r>
+      <w:proofErr w:type="gramEnd"/>
+      <w:r>
+        <w:rPr>
+          <w:rFonts w:ascii="Calibri" w:hAnsi="Calibri" w:cs="Calibri"/>
+          <w:sz w:val="24"/>
+          <w:szCs w:val="24"/>
+        </w:rPr>
+        <w:t xml:space="preserve"> of interest, creating boxplots using technology, and interpreting your findings in the context of this situation.</w:t>
       </w:r>
     </w:p>
     <w:p>

</xml_diff>